<commit_message>
ex2 - complete theoretical solutions
</commit_message>
<xml_diff>
--- a/ex2/hw2_solution.docx
+++ b/ex2/hw2_solution.docx
@@ -141,31 +141,15 @@
         <w:t>2. Aperture problem – when looking on a small portion of moving object (looking from within a small hole) we can’t determine the exact direction of the movement of this object. Therefore, the object can move in many different directions that will look the same from the point of view of this small hole.</w:t>
       </w:r>
       <w:r>
-        <w:t xml:space="preserve"> We can mitigate the problem by </w:t>
-      </w:r>
-      <w:proofErr w:type="gramStart"/>
-      <w:r>
-        <w:t>analyzing  the</w:t>
-      </w:r>
-      <w:proofErr w:type="gramEnd"/>
-      <w:r>
-        <w:t xml:space="preserve"> movement of an object by using aperture (windows) of different size or down sampling the image and use the analysis of different sampling rate images to determine the movement of the same scene.</w:t>
-      </w:r>
-    </w:p>
-    <w:p>
-      <w:pPr>
-        <w:bidi w:val="0"/>
-      </w:pPr>
-      <w:r>
-        <w:t xml:space="preserve">3. To solve the optical flow problem, the Lucas-Kanade assumes that a neighborhood of a pixel moves in the same direction for all </w:t>
-      </w:r>
-      <w:proofErr w:type="gramStart"/>
-      <w:r>
-        <w:t>pixel</w:t>
-      </w:r>
-      <w:proofErr w:type="gramEnd"/>
-      <w:r>
-        <w:t>.</w:t>
+        <w:t xml:space="preserve"> We can mitigate the problem by analyzing  the movement of an object by using aperture (windows) of different size or down sampling the image and use the analysis of different sampling rate images to determine the movement of the same scene.</w:t>
+      </w:r>
+    </w:p>
+    <w:p>
+      <w:pPr>
+        <w:bidi w:val="0"/>
+      </w:pPr>
+      <w:r>
+        <w:t>3. To solve the optical flow problem, the Lucas-Kanade assumes that a neighborhood of a pixel moves in the same direction for all pixel.</w:t>
       </w:r>
     </w:p>
     <w:p>
@@ -182,6 +166,9 @@
       </w:pPr>
       <w:r>
         <w:t>5.</w:t>
+      </w:r>
+      <w:r>
+        <w:t xml:space="preserve"> </w:t>
       </w:r>
       <w:r>
         <w:t xml:space="preserve">To calculate the optical flow of the object’s boundaries we need to determine which pixel related to the object and which to its surroundings. Once we have that </w:t>
@@ -225,7 +212,13 @@
           <w:u w:val="single"/>
         </w:rPr>
         <w:lastRenderedPageBreak/>
-        <w:t>Section 2 – 2.1 Optical Flow One Step</w:t>
+        <w:t>Section 2 – Optical Flow One Step</w:t>
+      </w:r>
+      <w:r>
+        <w:rPr>
+          <w:u w:val="single"/>
+        </w:rPr>
+        <w:t xml:space="preserve"> and full LK </w:t>
       </w:r>
     </w:p>
     <w:p>
@@ -295,180 +288,731 @@
     <w:p>
       <w:pPr>
         <w:bidi w:val="0"/>
+      </w:pPr>
+      <w:r>
+        <w:t>warped river_2.png:</w:t>
+      </w:r>
+      <w:r>
+        <w:br/>
+      </w:r>
+    </w:p>
+    <w:p>
+      <w:pPr>
+        <w:bidi w:val="0"/>
+      </w:pPr>
+      <w:r>
+        <w:drawing>
+          <wp:anchor distT="0" distB="0" distL="114300" distR="114300" simplePos="0" relativeHeight="251658240" behindDoc="0" locked="0" layoutInCell="1" allowOverlap="1" wp14:anchorId="71FA0996" wp14:editId="4A74C2F6">
+            <wp:simplePos x="0" y="0"/>
+            <wp:positionH relativeFrom="margin">
+              <wp:align>center</wp:align>
+            </wp:positionH>
+            <wp:positionV relativeFrom="paragraph">
+              <wp:posOffset>-239313</wp:posOffset>
+            </wp:positionV>
+            <wp:extent cx="3009900" cy="2400300"/>
+            <wp:effectExtent l="0" t="0" r="0" b="0"/>
+            <wp:wrapSquare wrapText="bothSides"/>
+            <wp:docPr id="380948760" name="Picture 2"/>
+            <wp:cNvGraphicFramePr>
+              <a:graphicFrameLocks xmlns:a="http://schemas.openxmlformats.org/drawingml/2006/main" noChangeAspect="1"/>
+            </wp:cNvGraphicFramePr>
+            <a:graphic xmlns:a="http://schemas.openxmlformats.org/drawingml/2006/main">
+              <a:graphicData uri="http://schemas.openxmlformats.org/drawingml/2006/picture">
+                <pic:pic xmlns:pic="http://schemas.openxmlformats.org/drawingml/2006/picture">
+                  <pic:nvPicPr>
+                    <pic:cNvPr id="0" name="Picture 6"/>
+                    <pic:cNvPicPr>
+                      <a:picLocks noChangeAspect="1" noChangeArrowheads="1"/>
+                    </pic:cNvPicPr>
+                  </pic:nvPicPr>
+                  <pic:blipFill>
+                    <a:blip r:embed="rId5">
+                      <a:extLst>
+                        <a:ext uri="{28A0092B-C50C-407E-A947-70E740481C1C}">
+                          <a14:useLocalDpi xmlns:a14="http://schemas.microsoft.com/office/drawing/2010/main" val="0"/>
+                        </a:ext>
+                      </a:extLst>
+                    </a:blip>
+                    <a:srcRect/>
+                    <a:stretch>
+                      <a:fillRect/>
+                    </a:stretch>
+                  </pic:blipFill>
+                  <pic:spPr bwMode="auto">
+                    <a:xfrm>
+                      <a:off x="0" y="0"/>
+                      <a:ext cx="3009900" cy="2400300"/>
+                    </a:xfrm>
+                    <a:prstGeom prst="rect">
+                      <a:avLst/>
+                    </a:prstGeom>
+                    <a:noFill/>
+                    <a:ln>
+                      <a:noFill/>
+                    </a:ln>
+                  </pic:spPr>
+                </pic:pic>
+              </a:graphicData>
+            </a:graphic>
+            <wp14:sizeRelH relativeFrom="page">
+              <wp14:pctWidth>0</wp14:pctWidth>
+            </wp14:sizeRelH>
+            <wp14:sizeRelV relativeFrom="page">
+              <wp14:pctHeight>0</wp14:pctHeight>
+            </wp14:sizeRelV>
+          </wp:anchor>
+        </w:drawing>
+      </w:r>
+    </w:p>
+    <w:p>
+      <w:pPr>
+        <w:bidi w:val="0"/>
+      </w:pPr>
+    </w:p>
+    <w:p>
+      <w:pPr>
+        <w:bidi w:val="0"/>
+      </w:pPr>
+    </w:p>
+    <w:p>
+      <w:pPr>
+        <w:bidi w:val="0"/>
+      </w:pPr>
+    </w:p>
+    <w:p>
+      <w:pPr>
+        <w:bidi w:val="0"/>
+      </w:pPr>
+    </w:p>
+    <w:p>
+      <w:pPr>
+        <w:bidi w:val="0"/>
+      </w:pPr>
+    </w:p>
+    <w:p>
+      <w:pPr>
+        <w:bidi w:val="0"/>
+      </w:pPr>
+    </w:p>
+    <w:p>
+      <w:pPr>
+        <w:bidi w:val="0"/>
+      </w:pPr>
+      <w:r>
+        <w:lastRenderedPageBreak/>
+        <w:t>The du and dv images represent the estimated pixel displacements between I1 and I2, showing movement along the columns (x-axis) and rows (y-axis), respectively. In these visualizations, most areas appear gray, indicating little to no estimated motion variation—this is often due to uniform texture regions, where tracking precise motion is more difficult, leading to approximated or uncertain flow values.</w:t>
+      </w:r>
+    </w:p>
+    <w:p>
+      <w:pPr>
+        <w:bidi w:val="0"/>
+      </w:pPr>
+      <w:r>
+        <w:t>A noticeable area of motion can be seen at the top of the du image, particularly around the dark cloud region. This area exhibits a clear shift to the right, reflecting the motion of the cloud between I1 and I2.</w:t>
+      </w:r>
+    </w:p>
+    <w:p>
+      <w:pPr>
+        <w:bidi w:val="0"/>
+      </w:pPr>
+      <w:r>
+        <w:t>The warping of I2 to I1 has imperfect areas that can be seen as noise in some areas such as the cloud on the top of the image.</w:t>
+      </w:r>
+      <w:r>
+        <w:t xml:space="preserve"> </w:t>
+      </w:r>
+    </w:p>
+    <w:p>
+      <w:pPr>
+        <w:bidi w:val="0"/>
+      </w:pPr>
+      <w:r>
+        <w:t xml:space="preserve">4.2. looking at the gifs it is shown that the result – I2 image warping is imperfect. A </w:t>
+      </w:r>
+      <w:r>
+        <w:t>perfect result</w:t>
+      </w:r>
+      <w:r>
+        <w:t xml:space="preserve"> would be th</w:t>
+      </w:r>
+      <w:r>
+        <w:t>e same as the “1_original.gif”</w:t>
+      </w:r>
+      <w:r>
+        <w:t xml:space="preserve">. </w:t>
+      </w:r>
+      <w:r>
+        <w:t>In our results, most of the image is warped correctly – mostly the bottom part of the image. However,</w:t>
+      </w:r>
+      <w:r>
+        <w:t xml:space="preserve"> there are noisy regions showing as areas with different pixel color related to </w:t>
+      </w:r>
+      <w:r>
+        <w:t>the objects color</w:t>
+      </w:r>
+      <w:r>
+        <w:t>.</w:t>
+      </w:r>
+      <w:r>
+        <w:t xml:space="preserve"> It is the most visible </w:t>
+      </w:r>
+      <w:r>
+        <w:t>in</w:t>
+      </w:r>
+      <w:r>
+        <w:t xml:space="preserve"> the cloud</w:t>
+      </w:r>
+      <w:r>
+        <w:t xml:space="preserve"> area</w:t>
+      </w:r>
+      <w:r>
+        <w:t>, which supposed to be mainly dark but has noisy bright areas in the warped image.</w:t>
+      </w:r>
+      <w:r>
+        <w:t xml:space="preserve"> </w:t>
+      </w:r>
+      <w:r>
+        <w:br/>
+      </w:r>
+      <w:r>
+        <w:br/>
+      </w:r>
+      <w:r>
+        <w:t>Several factors could contribute to these imperfections:</w:t>
+      </w:r>
+      <w:r>
+        <w:br/>
+        <w:t>1. The</w:t>
+      </w:r>
+      <w:r>
+        <w:t xml:space="preserve"> L-K algorithm is based on approximations such as </w:t>
+      </w:r>
+      <w:r>
+        <w:t xml:space="preserve">considering only the </w:t>
+      </w:r>
+      <w:r>
+        <w:t xml:space="preserve">first order </w:t>
+      </w:r>
+      <w:r>
+        <w:t>Taylor</w:t>
+      </w:r>
+      <w:r>
+        <w:t xml:space="preserve"> approximation and not further orders.</w:t>
+      </w:r>
+      <w:r>
+        <w:br/>
+      </w:r>
+      <w:r>
+        <w:t>2. T</w:t>
+      </w:r>
+      <w:r>
+        <w:t xml:space="preserve">he constant brightness assumption which </w:t>
+      </w:r>
+      <w:r>
+        <w:t>might be</w:t>
+      </w:r>
+      <w:r>
+        <w:t xml:space="preserve"> correct most of the times but not always</w:t>
+      </w:r>
+      <w:r>
+        <w:t>. This</w:t>
+      </w:r>
+      <w:r>
+        <w:t xml:space="preserve"> can be seen in the cloud’s region which as several types of grey and probably same scene </w:t>
+      </w:r>
+      <w:r>
+        <w:t>point’s</w:t>
+      </w:r>
+      <w:r>
+        <w:t xml:space="preserve"> brightness is slightly different</w:t>
+      </w:r>
+      <w:r>
+        <w:t xml:space="preserve"> in I1 compared to I2</w:t>
+      </w:r>
+      <w:r>
+        <w:t xml:space="preserve"> related to the cloud’s density.</w:t>
+      </w:r>
+      <w:r>
+        <w:br/>
+      </w:r>
+      <w:r>
+        <w:t>3</w:t>
+      </w:r>
+      <w:r>
+        <w:t>. The</w:t>
+      </w:r>
+      <w:r>
+        <w:t xml:space="preserve"> L-K algorithm assumes that all the pixels in the window have the same optical flow</w:t>
+      </w:r>
+      <w:r>
+        <w:t xml:space="preserve"> </w:t>
+      </w:r>
+      <w:proofErr w:type="spellStart"/>
+      <w:r>
+        <w:t>i.e</w:t>
+      </w:r>
+      <w:proofErr w:type="spellEnd"/>
+      <w:r>
+        <w:t xml:space="preserve"> u and v</w:t>
+      </w:r>
+      <w:r>
+        <w:t>, which not always correct.</w:t>
+      </w:r>
+      <w:r>
+        <w:br/>
+        <w:t>All those points can cause imperfections.</w:t>
+      </w:r>
+      <w:r>
+        <w:br/>
+      </w:r>
+      <w:r>
+        <w:br/>
+      </w:r>
+      <w:r>
+        <w:br/>
+      </w:r>
+      <w:r>
+        <w:br/>
+      </w:r>
+      <w:r>
+        <w:br/>
+      </w:r>
+      <w:r>
+        <w:br/>
+      </w:r>
+      <w:r>
+        <w:br/>
+      </w:r>
+      <w:r>
+        <w:br/>
+      </w:r>
+      <w:r>
+        <w:br/>
+      </w:r>
+      <w:r>
+        <w:br/>
+      </w:r>
+      <w:r>
+        <w:br/>
+      </w:r>
+      <w:r>
+        <w:br/>
+      </w:r>
+      <w:r>
+        <w:br/>
+      </w:r>
+      <w:r>
+        <w:br/>
+      </w:r>
+      <w:r>
+        <w:br/>
+      </w:r>
+      <w:r>
+        <w:br/>
+      </w:r>
+      <w:r>
+        <w:br/>
+      </w:r>
+      <w:r>
+        <w:br/>
+      </w:r>
+    </w:p>
+    <w:p>
+      <w:pPr>
+        <w:bidi w:val="0"/>
+      </w:pPr>
+      <w:r>
+        <w:rPr>
+          <w:noProof/>
+        </w:rPr>
+        <w:lastRenderedPageBreak/>
+        <w:drawing>
+          <wp:anchor distT="0" distB="0" distL="114300" distR="114300" simplePos="0" relativeHeight="251660288" behindDoc="0" locked="0" layoutInCell="1" allowOverlap="1" wp14:anchorId="45F460E1" wp14:editId="41022533">
+            <wp:simplePos x="0" y="0"/>
+            <wp:positionH relativeFrom="column">
+              <wp:posOffset>1236972</wp:posOffset>
+            </wp:positionH>
+            <wp:positionV relativeFrom="paragraph">
+              <wp:posOffset>5230082</wp:posOffset>
+            </wp:positionV>
+            <wp:extent cx="3010535" cy="2399030"/>
+            <wp:effectExtent l="0" t="0" r="0" b="1270"/>
+            <wp:wrapSquare wrapText="bothSides"/>
+            <wp:docPr id="399879915" name="Picture 6" descr="A black and white image of a mountain&#10;&#10;Description automatically generated"/>
+            <wp:cNvGraphicFramePr>
+              <a:graphicFrameLocks xmlns:a="http://schemas.openxmlformats.org/drawingml/2006/main" noChangeAspect="1"/>
+            </wp:cNvGraphicFramePr>
+            <a:graphic xmlns:a="http://schemas.openxmlformats.org/drawingml/2006/main">
+              <a:graphicData uri="http://schemas.openxmlformats.org/drawingml/2006/picture">
+                <pic:pic xmlns:pic="http://schemas.openxmlformats.org/drawingml/2006/picture">
+                  <pic:nvPicPr>
+                    <pic:cNvPr id="399879915" name="Picture 6" descr="A black and white image of a mountain&#10;&#10;Description automatically generated"/>
+                    <pic:cNvPicPr>
+                      <a:picLocks noChangeAspect="1" noChangeArrowheads="1"/>
+                    </pic:cNvPicPr>
+                  </pic:nvPicPr>
+                  <pic:blipFill>
+                    <a:blip r:embed="rId6">
+                      <a:extLst>
+                        <a:ext uri="{28A0092B-C50C-407E-A947-70E740481C1C}">
+                          <a14:useLocalDpi xmlns:a14="http://schemas.microsoft.com/office/drawing/2010/main" val="0"/>
+                        </a:ext>
+                      </a:extLst>
+                    </a:blip>
+                    <a:srcRect/>
+                    <a:stretch>
+                      <a:fillRect/>
+                    </a:stretch>
+                  </pic:blipFill>
+                  <pic:spPr bwMode="auto">
+                    <a:xfrm>
+                      <a:off x="0" y="0"/>
+                      <a:ext cx="3010535" cy="2399030"/>
+                    </a:xfrm>
+                    <a:prstGeom prst="rect">
+                      <a:avLst/>
+                    </a:prstGeom>
+                    <a:noFill/>
+                    <a:ln>
+                      <a:noFill/>
+                    </a:ln>
+                  </pic:spPr>
+                </pic:pic>
+              </a:graphicData>
+            </a:graphic>
+            <wp14:sizeRelH relativeFrom="page">
+              <wp14:pctWidth>0</wp14:pctWidth>
+            </wp14:sizeRelH>
+            <wp14:sizeRelV relativeFrom="page">
+              <wp14:pctHeight>0</wp14:pctHeight>
+            </wp14:sizeRelV>
+          </wp:anchor>
+        </w:drawing>
+      </w:r>
+      <w:r>
+        <w:rPr>
+          <w:noProof/>
+        </w:rPr>
+        <w:drawing>
+          <wp:anchor distT="0" distB="0" distL="114300" distR="114300" simplePos="0" relativeHeight="251659264" behindDoc="0" locked="0" layoutInCell="1" allowOverlap="1" wp14:anchorId="0F876AB1" wp14:editId="5E88D45F">
+            <wp:simplePos x="0" y="0"/>
+            <wp:positionH relativeFrom="margin">
+              <wp:align>left</wp:align>
+            </wp:positionH>
+            <wp:positionV relativeFrom="paragraph">
+              <wp:posOffset>183515</wp:posOffset>
+            </wp:positionV>
+            <wp:extent cx="4946015" cy="4946015"/>
+            <wp:effectExtent l="0" t="0" r="6985" b="6985"/>
+            <wp:wrapSquare wrapText="bothSides"/>
+            <wp:docPr id="1482260528" name="Picture 5"/>
+            <wp:cNvGraphicFramePr>
+              <a:graphicFrameLocks xmlns:a="http://schemas.openxmlformats.org/drawingml/2006/main" noChangeAspect="1"/>
+            </wp:cNvGraphicFramePr>
+            <a:graphic xmlns:a="http://schemas.openxmlformats.org/drawingml/2006/main">
+              <a:graphicData uri="http://schemas.openxmlformats.org/drawingml/2006/picture">
+                <pic:pic xmlns:pic="http://schemas.openxmlformats.org/drawingml/2006/picture">
+                  <pic:nvPicPr>
+                    <pic:cNvPr id="0" name="Picture 18"/>
+                    <pic:cNvPicPr>
+                      <a:picLocks noChangeAspect="1" noChangeArrowheads="1"/>
+                    </pic:cNvPicPr>
+                  </pic:nvPicPr>
+                  <pic:blipFill>
+                    <a:blip r:embed="rId7">
+                      <a:extLst>
+                        <a:ext uri="{28A0092B-C50C-407E-A947-70E740481C1C}">
+                          <a14:useLocalDpi xmlns:a14="http://schemas.microsoft.com/office/drawing/2010/main" val="0"/>
+                        </a:ext>
+                      </a:extLst>
+                    </a:blip>
+                    <a:srcRect/>
+                    <a:stretch>
+                      <a:fillRect/>
+                    </a:stretch>
+                  </pic:blipFill>
+                  <pic:spPr bwMode="auto">
+                    <a:xfrm>
+                      <a:off x="0" y="0"/>
+                      <a:ext cx="4946015" cy="4946015"/>
+                    </a:xfrm>
+                    <a:prstGeom prst="rect">
+                      <a:avLst/>
+                    </a:prstGeom>
+                    <a:noFill/>
+                    <a:ln>
+                      <a:noFill/>
+                    </a:ln>
+                  </pic:spPr>
+                </pic:pic>
+              </a:graphicData>
+            </a:graphic>
+            <wp14:sizeRelH relativeFrom="page">
+              <wp14:pctWidth>0</wp14:pctWidth>
+            </wp14:sizeRelH>
+            <wp14:sizeRelV relativeFrom="page">
+              <wp14:pctHeight>0</wp14:pctHeight>
+            </wp14:sizeRelV>
+          </wp:anchor>
+        </w:drawing>
+      </w:r>
+      <w:r>
+        <w:t xml:space="preserve">6. </w:t>
+      </w:r>
+      <w:r>
+        <w:t>Results of the c</w:t>
+      </w:r>
+      <w:r>
+        <w:t>omplete run of the main_river.py</w:t>
+      </w:r>
+      <w:r>
+        <w:t xml:space="preserve"> file</w:t>
+      </w:r>
+      <w:r>
+        <w:t>:</w:t>
+      </w:r>
+      <w:r>
+        <w:br/>
+      </w:r>
+      <w:r>
+        <w:br/>
+      </w:r>
+    </w:p>
+    <w:p>
+      <w:pPr>
+        <w:bidi w:val="0"/>
+      </w:pPr>
+    </w:p>
+    <w:p>
+      <w:pPr>
+        <w:bidi w:val="0"/>
+      </w:pPr>
+    </w:p>
+    <w:p>
+      <w:pPr>
+        <w:bidi w:val="0"/>
+      </w:pPr>
+    </w:p>
+    <w:p>
+      <w:pPr>
+        <w:bidi w:val="0"/>
+      </w:pPr>
+    </w:p>
+    <w:p>
+      <w:pPr>
+        <w:bidi w:val="0"/>
+      </w:pPr>
+    </w:p>
+    <w:p>
+      <w:pPr>
+        <w:bidi w:val="0"/>
+      </w:pPr>
+    </w:p>
+    <w:p>
+      <w:pPr>
+        <w:bidi w:val="0"/>
+      </w:pPr>
+    </w:p>
+    <w:p>
+      <w:pPr>
+        <w:bidi w:val="0"/>
+      </w:pPr>
+    </w:p>
+    <w:p>
+      <w:pPr>
+        <w:bidi w:val="0"/>
+      </w:pPr>
+      <w:r>
+        <w:t xml:space="preserve">In the full LK results it is shown that the noise is reduced and the warped I2 image is much </w:t>
+      </w:r>
+      <w:r>
+        <w:t>cleaner</w:t>
+      </w:r>
+      <w:r>
+        <w:t xml:space="preserve"> and its objects are smooth.</w:t>
+      </w:r>
+      <w:r>
+        <w:br/>
+        <w:t>In the full LK results we use the Pyramid method for averaging the u and v on different sizes of the image and by that get a more balanced and correct result of the optical flow.</w:t>
+      </w:r>
+      <w:r>
+        <w:br/>
+        <w:t>We also enable find and coarse detail preservation due to that mechanism.</w:t>
+      </w:r>
+      <w:r>
+        <w:br/>
+      </w:r>
+    </w:p>
+    <w:p>
+      <w:pPr>
+        <w:bidi w:val="0"/>
+      </w:pPr>
+      <w:r>
         <w:rPr>
           <w:u w:val="single"/>
         </w:rPr>
-      </w:pPr>
-    </w:p>
-    <w:p>
-      <w:pPr>
-        <w:bidi w:val="0"/>
-      </w:pPr>
-      <w:r>
-        <w:t>The du and dv images represent the estimated pixel displacements between I1 and I2, showing movement along the columns (x-axis) and rows (y-axis), respectively. In these visualizations, most areas appear gray, indicating little to no estimated motion variation—this is often due to uniform texture regions, where tracking precise motion is more difficult, leading to approximated or uncertain flow values.</w:t>
-      </w:r>
-    </w:p>
-    <w:p>
-      <w:pPr>
-        <w:bidi w:val="0"/>
-      </w:pPr>
-      <w:r>
-        <w:t>A noticeable area of motion can be seen at the top of the du image, particularly around the dark cloud region. This area exhibits a clear shift to the right, reflecting the motion of the cloud between I1 and I2.</w:t>
-      </w:r>
-    </w:p>
-    <w:p>
-      <w:pPr>
-        <w:bidi w:val="0"/>
-      </w:pPr>
-      <w:r>
-        <w:t>The warping of I2 to I1 has imperfect areas that can be seen as noise in some areas such as the cloud on the top of the image.</w:t>
+        <w:lastRenderedPageBreak/>
+        <w:t xml:space="preserve">Section </w:t>
+      </w:r>
+      <w:r>
+        <w:rPr>
+          <w:u w:val="single"/>
+        </w:rPr>
+        <w:t>3</w:t>
+      </w:r>
+      <w:r>
+        <w:rPr>
+          <w:u w:val="single"/>
+        </w:rPr>
+        <w:t>- Video</w:t>
+      </w:r>
+      <w:r>
+        <w:rPr>
+          <w:u w:val="single"/>
+        </w:rPr>
+        <w:t xml:space="preserve"> Stabilization</w:t>
+      </w:r>
+      <w:r>
+        <w:rPr>
+          <w:u w:val="single"/>
+        </w:rPr>
+        <w:br/>
+      </w:r>
+      <w:r>
+        <w:t>8. The execution of the main_tau_video.py created a first implementation of a stabilized video. We get a video that shows less movement between frames and indeed more stabilized. The video processing took us around 1500 seconds which is relatively long time.</w:t>
+      </w:r>
+      <w:r>
+        <w:br/>
+        <w:t xml:space="preserve">As described in the </w:t>
+      </w:r>
+      <w:r>
+        <w:t>instruction’s</w:t>
+      </w:r>
+      <w:r>
+        <w:t xml:space="preserve"> pdf, we do get border effects caused by the imperfections of the LK algorithm.</w:t>
+      </w:r>
+      <w:r>
+        <w:br/>
+      </w:r>
+      <w:r>
+        <w:t xml:space="preserve">The </w:t>
+      </w:r>
+      <w:r>
+        <w:t xml:space="preserve">mean </w:t>
+      </w:r>
+      <w:r>
+        <w:t>MSE between frames: 17.47</w:t>
+      </w:r>
+      <w:r>
+        <w:t xml:space="preserve"> which point on the more stabilized video in general.</w:t>
+      </w:r>
+      <w:r>
+        <w:br/>
+      </w:r>
+      <w:r>
+        <w:br/>
+        <w:t>9-12. We implemented the faster and faster</w:t>
       </w:r>
       <w:r>
         <w:t xml:space="preserve"> </w:t>
       </w:r>
-    </w:p>
-    <w:p>
-      <w:pPr>
-        <w:bidi w:val="0"/>
-      </w:pPr>
-      <w:r>
-        <w:t xml:space="preserve">4.2. looking at the gifs it is shown that the result – I2 image warping is imperfect. A </w:t>
-      </w:r>
-      <w:r>
-        <w:t>perfect result</w:t>
-      </w:r>
-      <w:r>
-        <w:t xml:space="preserve"> would be th</w:t>
-      </w:r>
-      <w:r>
-        <w:t>e same as the “1_original.gif”</w:t>
-      </w:r>
-      <w:r>
-        <w:t xml:space="preserve">. </w:t>
-      </w:r>
-      <w:r>
-        <w:t xml:space="preserve">In our results, most of the image </w:t>
-      </w:r>
-      <w:r>
-        <w:lastRenderedPageBreak/>
-        <w:t>is warped correctly – mostly the bottom part of the image. However,</w:t>
-      </w:r>
-      <w:r>
-        <w:t xml:space="preserve"> there are noisy regions showing as areas with different pixel color related to </w:t>
-      </w:r>
-      <w:r>
-        <w:t>the objects color</w:t>
-      </w:r>
-      <w:r>
-        <w:t>.</w:t>
-      </w:r>
-      <w:r>
-        <w:t xml:space="preserve"> It is the most visible </w:t>
-      </w:r>
-      <w:proofErr w:type="gramStart"/>
-      <w:r>
-        <w:t>in the area of</w:t>
-      </w:r>
-      <w:proofErr w:type="gramEnd"/>
-      <w:r>
-        <w:t xml:space="preserve"> the cloud, which supposed to be mainly dark but has noisy bright areas in the warped image.</w:t>
+      <w:r>
+        <w:t>+</w:t>
       </w:r>
       <w:r>
         <w:t xml:space="preserve"> </w:t>
       </w:r>
       <w:r>
-        <w:br/>
-      </w:r>
-      <w:r>
-        <w:br/>
-      </w:r>
-      <w:r>
-        <w:t>Several factors could contribute to these imperfections:</w:t>
-      </w:r>
-      <w:r>
-        <w:br/>
-        <w:t>1. The</w:t>
-      </w:r>
-      <w:r>
-        <w:t xml:space="preserve"> L-K algorithm is based on approximations such as </w:t>
-      </w:r>
-      <w:r>
-        <w:t xml:space="preserve">considering only the </w:t>
-      </w:r>
-      <w:r>
-        <w:t xml:space="preserve">first order </w:t>
-      </w:r>
-      <w:r>
-        <w:t>Taylor</w:t>
-      </w:r>
-      <w:r>
-        <w:t xml:space="preserve"> approximation and not further orders.</w:t>
-      </w:r>
-      <w:r>
-        <w:br/>
-      </w:r>
-      <w:r>
-        <w:t>2. T</w:t>
-      </w:r>
-      <w:r>
-        <w:t xml:space="preserve">he constant brightness assumption which </w:t>
-      </w:r>
-      <w:r>
-        <w:t>might be</w:t>
-      </w:r>
-      <w:r>
-        <w:t xml:space="preserve"> correct most of the times but not always</w:t>
-      </w:r>
-      <w:r>
-        <w:t>. This</w:t>
-      </w:r>
-      <w:r>
-        <w:t xml:space="preserve"> can be seen in the cloud’s region which as several types of grey and probably same scene </w:t>
-      </w:r>
-      <w:r>
-        <w:t>point’s</w:t>
-      </w:r>
-      <w:r>
-        <w:t xml:space="preserve"> brightness is slightly different</w:t>
-      </w:r>
-      <w:r>
-        <w:t xml:space="preserve"> in I1 compared to I2</w:t>
-      </w:r>
-      <w:r>
-        <w:t xml:space="preserve"> related to the cloud’s density.</w:t>
-      </w:r>
-      <w:r>
-        <w:br/>
-      </w:r>
-      <w:r>
-        <w:t>3. T</w:t>
-      </w:r>
-      <w:r>
-        <w:t xml:space="preserve">he </w:t>
-      </w:r>
-      <w:proofErr w:type="spellStart"/>
-      <w:proofErr w:type="gramStart"/>
-      <w:r>
-        <w:t>u,v</w:t>
-      </w:r>
-      <w:proofErr w:type="spellEnd"/>
-      <w:proofErr w:type="gramEnd"/>
-      <w:r>
-        <w:t xml:space="preserve"> calculation per window can have errors since this calculation can face singular matrix.</w:t>
-      </w:r>
-      <w:r>
-        <w:br/>
-      </w:r>
-      <w:r>
-        <w:t>4. The</w:t>
-      </w:r>
-      <w:r>
-        <w:t xml:space="preserve"> L-K algorithm assumes that all the pixels in the window have the same optical flow, which not always correct.</w:t>
-      </w:r>
-      <w:r>
-        <w:br/>
-        <w:t>All those points can cause imperfections.</w:t>
-      </w:r>
+        <w:t>border fixes and got the following MSEs:</w:t>
+      </w:r>
+      <w:r>
+        <w:br/>
+        <w:t>Faster LK mean MSE between frames – 35.91</w:t>
+      </w:r>
+    </w:p>
+    <w:p>
+      <w:pPr>
+        <w:bidi w:val="0"/>
+      </w:pPr>
+      <w:r>
+        <w:t>Faster</w:t>
+      </w:r>
+      <w:r>
+        <w:t xml:space="preserve"> </w:t>
+      </w:r>
+      <w:r>
+        <w:t>+</w:t>
+      </w:r>
+      <w:r>
+        <w:t xml:space="preserve"> b</w:t>
+      </w:r>
+      <w:r>
+        <w:t xml:space="preserve">order correction mean MSE between frames – </w:t>
+      </w:r>
+      <w:r>
+        <w:t>32.10</w:t>
+      </w:r>
+    </w:p>
+    <w:p>
+      <w:pPr>
+        <w:bidi w:val="0"/>
+      </w:pPr>
+      <w:r>
+        <w:t xml:space="preserve">It does make sense that the mean MSE </w:t>
+      </w:r>
+      <w:r>
+        <w:t xml:space="preserve">of the faster implementation </w:t>
+      </w:r>
+      <w:r>
+        <w:t>will be larger since we choose speed over accuracy in that case by calculating LK only on significant pixels of the image and not the entire image.</w:t>
+      </w:r>
+      <w:r>
+        <w:br/>
+      </w:r>
+      <w:r>
+        <w:t>W</w:t>
+      </w:r>
+      <w:r>
+        <w:t xml:space="preserve">e get </w:t>
+      </w:r>
+      <w:r>
+        <w:t>some</w:t>
+      </w:r>
+      <w:r>
+        <w:t xml:space="preserve"> improvement between the fast and fast</w:t>
+      </w:r>
+      <w:r>
+        <w:t xml:space="preserve">er </w:t>
+      </w:r>
+      <w:r>
+        <w:t>+</w:t>
+      </w:r>
+      <w:r>
+        <w:t xml:space="preserve"> </w:t>
+      </w:r>
+      <w:r>
+        <w:t>border correction</w:t>
+      </w:r>
+      <w:r>
+        <w:t>, the video does seem with less border related issues.</w:t>
+      </w:r>
+      <w:r>
+        <w:br/>
+      </w:r>
+    </w:p>
+    <w:p>
+      <w:pPr>
+        <w:bidi w:val="0"/>
+      </w:pPr>
+      <w:r>
+        <w:br w:type="page"/>
+      </w:r>
+    </w:p>
+    <w:p>
+      <w:pPr>
+        <w:bidi w:val="0"/>
+      </w:pPr>
     </w:p>
     <w:sectPr>
       <w:pgSz w:w="11906" w:h="16838"/>
@@ -1401,6 +1945,19 @@
       <w:spacing w:val="5"/>
     </w:rPr>
   </w:style>
+  <w:style w:type="paragraph" w:styleId="NormalWeb">
+    <w:name w:val="Normal (Web)"/>
+    <w:basedOn w:val="Normal"/>
+    <w:uiPriority w:val="99"/>
+    <w:semiHidden/>
+    <w:unhideWhenUsed/>
+    <w:rsid w:val="00FD187B"/>
+    <w:rPr>
+      <w:rFonts w:ascii="Times New Roman" w:hAnsi="Times New Roman" w:cs="Times New Roman"/>
+      <w:sz w:val="24"/>
+      <w:szCs w:val="24"/>
+    </w:rPr>
+  </w:style>
 </w:styles>
 </file>
 

</xml_diff>